<commit_message>
Document 06 v1.1 : intégrer ADR-094 et ADR-095 (modifications suivies)
Révision du document 06 (Versions et feuille de route) par modifications
suivies à accepter : retrait du laboratoire au lieu d'une couche de
compatibilité (§2, §4.6, §4.7, définition du cutover, scénario A), gate E1
redéfinie, E2 « premier adapter », E3 « Domain IR », E10 sans legacy,
horizon et gate R0 sur le golden Asteria. Fiche de contrôle : v1.1,
septembre 2026.

Le tag laboratory-final est abandonné : f2590a8 reste atteignable comme
ancêtre de main. Gouvernance mise à jour (ARB-12 partiel : reste le
document 03 §6.11).

Co-Authored-By: Claude Opus 5.5 <noreply@anthropic.com>
Claude-Session: https://claude.ai/code/session_01FkGXpMkPiAicNjd6X3E7sz
</commit_message>
<xml_diff>
--- a/docs/06 — Versions et feuille de route — ENISTERE FOUNDATION.docx
+++ b/docs/06 — Versions et feuille de route — ENISTERE FOUNDATION.docx
@@ -199,16 +199,30 @@
           <w:szCs w:val="21"/>
         </w:rPr>
       </w:pPr>
-      <w:r>
-        <w:rPr>
-          <w:rFonts w:ascii="Roboto" w:cs="Roboto" w:eastAsia="Roboto" w:hAnsi="Roboto"/>
-          <w:color w:val="475569"/>
-          <w:sz w:val="21"/>
-          <w:szCs w:val="21"/>
-          <w:rtl w:val="0"/>
-        </w:rPr>
-        <w:t xml:space="preserve">Version 1.0 — Dossier projet final — Août 2026</w:t>
-      </w:r>
+      <w:del w:id="9001" w:author="Claude" w:date="2026-09-25T00:00:00Z">
+        <w:r>
+          <w:rPr>
+            <w:rFonts w:ascii="Roboto" w:cs="Roboto" w:eastAsia="Roboto" w:hAnsi="Roboto"/>
+            <w:color w:val="475569"/>
+            <w:sz w:val="21"/>
+            <w:szCs w:val="21"/>
+            <w:rtl w:val="0"/>
+          </w:rPr>
+          <w:delText xml:space="preserve">Version 1.0 — Dossier projet final — Août 2026</w:delText>
+        </w:r>
+      </w:del>
+      <w:ins w:id="9002" w:author="Claude" w:date="2026-09-25T00:00:00Z">
+        <w:r>
+          <w:rPr>
+            <w:rFonts w:ascii="Roboto" w:cs="Roboto" w:eastAsia="Roboto" w:hAnsi="Roboto"/>
+            <w:color w:val="475569"/>
+            <w:sz w:val="21"/>
+            <w:szCs w:val="21"/>
+            <w:rtl w:val="0"/>
+          </w:rPr>
+          <w:t xml:space="preserve">Version 1.1 — Dossier projet final — Septembre 2026</w:t>
+        </w:r>
+      </w:ins>
     </w:p>
     <w:p>
       <w:pPr>
@@ -597,13 +611,24 @@
                 <w:szCs w:val="19"/>
               </w:rPr>
             </w:pPr>
-            <w:r>
-              <w:rPr>
-                <w:rFonts w:ascii="Roboto" w:hAnsi="Roboto" w:eastAsia="Roboto"/>
-                <w:sz w:val="17"/>
-              </w:rPr>
-              <w:t>1.0</w:t>
-            </w:r>
+            <w:del w:id="9045" w:author="Claude" w:date="2026-09-25T00:00:00Z">
+              <w:r>
+                <w:rPr>
+                  <w:rFonts w:ascii="Roboto" w:hAnsi="Roboto" w:eastAsia="Roboto"/>
+                  <w:sz w:val="17"/>
+                </w:rPr>
+                <w:delText xml:space="preserve">1.0</w:delText>
+              </w:r>
+            </w:del>
+            <w:ins w:id="9046" w:author="Claude" w:date="2026-09-25T00:00:00Z">
+              <w:r>
+                <w:rPr>
+                  <w:rFonts w:ascii="Roboto" w:hAnsi="Roboto" w:eastAsia="Roboto"/>
+                  <w:sz w:val="17"/>
+                </w:rPr>
+                <w:t xml:space="preserve">1.1</w:t>
+              </w:r>
+            </w:ins>
           </w:p>
         </w:tc>
       </w:tr>
@@ -699,13 +724,24 @@
                 <w:szCs w:val="19"/>
               </w:rPr>
             </w:pPr>
-            <w:r>
-              <w:rPr>
-                <w:rFonts w:ascii="Roboto" w:hAnsi="Roboto" w:eastAsia="Roboto"/>
-                <w:sz w:val="17"/>
-              </w:rPr>
-              <w:t>Août 2026</w:t>
-            </w:r>
+            <w:del w:id="9047" w:author="Claude" w:date="2026-09-25T00:00:00Z">
+              <w:r>
+                <w:rPr>
+                  <w:rFonts w:ascii="Roboto" w:hAnsi="Roboto" w:eastAsia="Roboto"/>
+                  <w:sz w:val="17"/>
+                </w:rPr>
+                <w:delText xml:space="preserve">Août 2026</w:delText>
+              </w:r>
+            </w:del>
+            <w:ins w:id="9048" w:author="Claude" w:date="2026-09-25T00:00:00Z">
+              <w:r>
+                <w:rPr>
+                  <w:rFonts w:ascii="Roboto" w:hAnsi="Roboto" w:eastAsia="Roboto"/>
+                  <w:sz w:val="17"/>
+                </w:rPr>
+                <w:t xml:space="preserve">Septembre 2026</w:t>
+              </w:r>
+            </w:ins>
           </w:p>
         </w:tc>
       </w:tr>
@@ -803,13 +839,24 @@
                 <w:szCs w:val="19"/>
               </w:rPr>
             </w:pPr>
-            <w:r>
-              <w:rPr>
-                <w:rFonts w:ascii="Roboto" w:hAnsi="Roboto" w:eastAsia="Roboto"/>
-                <w:sz w:val="17"/>
-              </w:rPr>
-              <w:t>BASELINE V1.0 — ROADMAP GATE-DRIVEN</w:t>
-            </w:r>
+            <w:del w:id="9003" w:author="Claude" w:date="2026-09-25T00:00:00Z">
+              <w:r>
+                <w:rPr>
+                  <w:rFonts w:ascii="Roboto" w:hAnsi="Roboto" w:eastAsia="Roboto"/>
+                  <w:sz w:val="17"/>
+                </w:rPr>
+                <w:delText xml:space="preserve">BASELINE V1.0 — ROADMAP GATE-DRIVEN</w:delText>
+              </w:r>
+            </w:del>
+            <w:ins w:id="9004" w:author="Claude" w:date="2026-09-25T00:00:00Z">
+              <w:r>
+                <w:rPr>
+                  <w:rFonts w:ascii="Roboto" w:hAnsi="Roboto" w:eastAsia="Roboto"/>
+                  <w:sz w:val="17"/>
+                </w:rPr>
+                <w:t xml:space="preserve">BASELINE V1.1 — ROADMAP GATE-DRIVEN (révision : ADR-094, ADR-095)</w:t>
+              </w:r>
+            </w:ins>
           </w:p>
         </w:tc>
       </w:tr>
@@ -1574,7 +1621,29 @@
         <w:rPr>
           <w:rFonts w:ascii="Roboto" w:hAnsi="Roboto" w:eastAsia="Roboto"/>
         </w:rPr>
-        <w:t>Les 18 premiers mois correspondent à R0 + V1 + V2. Cette période est cohérente avec le financement initial de 180 M FCFA du Plan d’affaires: elle doit permettre de transformer le laboratoire en Target Kernel sans big-bang rewrite, prouver la boucle complète Need → Decision → System → Evidence → Controlled Change, puis démontrer que des standards, profiles, policies, Design Systems et extensions peuvent être réellement réutilisés entre plusieurs systèmes et équipes.</w:t>
+        <w:t xml:space="preserve">Les 18 premiers mois correspondent à R0 + V1 + V2. Cette période est cohérente avec le financement initial de 180 M FCFA du Plan d’affaires: elle doit permettre de </w:t>
+      </w:r>
+      <w:del w:id="9005" w:author="Claude" w:date="2026-09-25T00:00:00Z">
+        <w:r>
+          <w:rPr>
+            <w:rFonts w:ascii="Roboto" w:hAnsi="Roboto" w:eastAsia="Roboto"/>
+          </w:rPr>
+          <w:delText xml:space="preserve">transformer le laboratoire en Target Kernel sans big-bang rewrite</w:delText>
+        </w:r>
+      </w:del>
+      <w:ins w:id="9006" w:author="Claude" w:date="2026-09-25T00:00:00Z">
+        <w:r>
+          <w:rPr>
+            <w:rFonts w:ascii="Roboto" w:hAnsi="Roboto" w:eastAsia="Roboto"/>
+          </w:rPr>
+          <w:t xml:space="preserve">construire le Target Kernel sur une base unique, sans héritage du laboratoire (ADR-094)</w:t>
+        </w:r>
+      </w:ins>
+      <w:r>
+        <w:rPr>
+          <w:rFonts w:ascii="Roboto" w:hAnsi="Roboto" w:eastAsia="Roboto"/>
+        </w:rPr>
+        <w:t xml:space="preserve">, prouver la boucle complète Need → Decision → System → Evidence → Controlled Change, puis démontrer que des standards, profiles, policies, Design Systems et extensions peuvent être réellement réutilisés entre plusieurs systèmes et équipes.</w:t>
       </w:r>
     </w:p>
     <w:p>
@@ -1676,16 +1745,7 @@
           <w:szCs w:val="21"/>
           <w:rtl w:val="0"/>
         </w:rPr>
-        <w:t xml:space="preserve">La règle de gouvernance de la roadmap est : RELEASE GATE OVER C</w:t>
-      </w:r>
-      <w:r>
-        <w:rPr>
-          <w:rFonts w:ascii="Roboto" w:cs="Roboto" w:eastAsia="Roboto" w:hAnsi="Roboto"/>
-          <w:sz w:val="21"/>
-          <w:szCs w:val="21"/>
-          <w:rtl w:val="0"/>
-        </w:rPr>
-        <w:t xml:space="preserve">ALENDAR. Une release est une capacité cohérente utilisable, prouvée par des scénarios, des tests, des Evidence et des résultats utilisateurs ; ce n’est pas une liste de fichiers terminés.</w:t>
+        <w:t xml:space="preserve">La règle de gouvernance de la roadmap est : RELEASE GATE OVER CALENDAR. Une release est une capacité cohérente utilisable, prouvée par des scénarios, des tests, des Evidence et des résultats utilisateurs ; ce n’est pas une liste de fichiers terminés.</w:t>
       </w:r>
     </w:p>
     <w:p>
@@ -2519,12 +2579,22 @@
           <w:szCs w:val="21"/>
         </w:rPr>
       </w:pPr>
-      <w:r>
-        <w:rPr>
-          <w:rFonts w:ascii="Roboto" w:hAnsi="Roboto" w:eastAsia="Roboto"/>
-        </w:rPr>
-        <w:t>Le repository expérimental constitue cependant une preuve et non l’architecture finale. Il possède déjà des actifs importants: pipeline Blueprint → CSM → ResolvedSystem → GenerationPlan, modèles déterministes, digests, runtime contracts, sept starters, Platform Baseline, capability manifests, conformance, goldens et regeneration ownership-aware. La roadmap doit réutiliser ces actifs sans faire de leur forme actuelle une contrainte constitutionnelle.</w:t>
-      </w:r>
+      <w:del w:id="9007" w:author="Claude" w:date="2026-09-25T00:00:00Z">
+        <w:r>
+          <w:rPr>
+            <w:rFonts w:ascii="Roboto" w:hAnsi="Roboto" w:eastAsia="Roboto"/>
+          </w:rPr>
+          <w:delText xml:space="preserve">Le repository expérimental constitue cependant une preuve et non l’architecture finale. Il possède déjà des actifs importants: pipeline Blueprint → CSM → ResolvedSystem → GenerationPlan, modèles déterministes, digests, runtime contracts, sept starters, Platform Baseline, capability manifests, conformance, goldens et regeneration ownership-aware. La roadmap doit réutiliser ces actifs sans faire de leur forme actuelle une contrainte constitutionnelle.</w:delText>
+        </w:r>
+      </w:del>
+      <w:ins w:id="9008" w:author="Claude" w:date="2026-09-25T00:00:00Z">
+        <w:r>
+          <w:rPr>
+            <w:rFonts w:ascii="Roboto" w:hAnsi="Roboto" w:eastAsia="Roboto"/>
+          </w:rPr>
+          <w:t xml:space="preserve">Le repository expérimental a servi de preuve exploratoire, mais il n’a jamais été mis en production ni utilisé. Il a donc été retiré au début de R0 (ADR-094) : ses enseignements — modèles déterministes, digests, runtime contracts, Platform Baseline, conformance, goldens et regeneration ownership-aware — guident la conception, mais aucun de ses actifs n’est repris tel quel ni ne contraint la cible.</w:t>
+        </w:r>
+      </w:ins>
     </w:p>
     <w:p>
       <w:pPr>
@@ -2576,8 +2646,46 @@
         <w:rPr>
           <w:rFonts w:ascii="Roboto" w:hAnsi="Roboto" w:eastAsia="Roboto"/>
         </w:rPr>
-        <w:t>Le plan de transition technique définit E0 → E1 → E2 → E3 → E4 → E5 → E6 → E7 → E8 → E9 → E10. E0 introduit les sept contrats autoritatifs minimaux; E1 crée la Kernel Façade; E2 prouve le protocole d’adapter; E3 sépare System Definition et IR interne. E4–E8 prouvent ownership, Evidence, Domain Contract, organization/design bindings, Day-2 change et substitution de runtime; E9 réalise le golden compétitif; E10 ne coupe vers le nouveau chemin canonique que si les preuves précédentes sont suffisantes.</w:t>
-      </w:r>
+        <w:t xml:space="preserve">Le plan de transition technique définit E0 → E1 → E2 → E3 → E4 → E5 → E6 → E7 → E8 → E9 → E10. E0 introduit les sept contrats autoritatifs minimaux; </w:t>
+      </w:r>
+      <w:del w:id="9009" w:author="Claude" w:date="2026-09-25T00:00:00Z">
+        <w:r>
+          <w:rPr>
+            <w:rFonts w:ascii="Roboto" w:hAnsi="Roboto" w:eastAsia="Roboto"/>
+          </w:rPr>
+          <w:delText xml:space="preserve">E1 crée la Kernel Façade; E2 prouve le protocole d’adapter; E3 sépare System Definition et IR interne.</w:delText>
+        </w:r>
+      </w:del>
+      <w:ins w:id="9010" w:author="Claude" w:date="2026-09-25T00:00:00Z">
+        <w:r>
+          <w:rPr>
+            <w:rFonts w:ascii="Roboto" w:hAnsi="Roboto" w:eastAsia="Roboto"/>
+          </w:rPr>
+          <w:t xml:space="preserve">E1 crée la Kernel Façade et sa chaîne native (System Closure → IR → résolution → plan); E2 prouve le protocole d’adapter; E3 introduit le Domain IR et enrichit l’IR.</w:t>
+        </w:r>
+      </w:ins>
+      <w:r>
+        <w:rPr>
+          <w:rFonts w:ascii="Roboto" w:hAnsi="Roboto" w:eastAsia="Roboto"/>
+        </w:rPr>
+        <w:t xml:space="preserve"> E4–E8 prouvent ownership, Evidence, Domain Contract, organization/design bindings, Day-2 change et substitution de runtime; E9 réalise le golden compétitif; </w:t>
+      </w:r>
+      <w:del w:id="9011" w:author="Claude" w:date="2026-09-25T00:00:00Z">
+        <w:r>
+          <w:rPr>
+            <w:rFonts w:ascii="Roboto" w:hAnsi="Roboto" w:eastAsia="Roboto"/>
+          </w:rPr>
+          <w:delText xml:space="preserve">E10 ne coupe vers le nouveau chemin canonique que si les preuves précédentes sont suffisantes.</w:delText>
+        </w:r>
+      </w:del>
+      <w:ins w:id="9012" w:author="Claude" w:date="2026-09-25T00:00:00Z">
+        <w:r>
+          <w:rPr>
+            <w:rFonts w:ascii="Roboto" w:hAnsi="Roboto" w:eastAsia="Roboto"/>
+          </w:rPr>
+          <w:t xml:space="preserve">E10 ne déclare le chemin Foundation canonique pour la V1 que si les preuves précédentes sont suffisantes.</w:t>
+        </w:r>
+      </w:ins>
     </w:p>
     <w:p>
       <w:pPr>
@@ -2660,14 +2768,36 @@
           <w:szCs w:val="21"/>
         </w:rPr>
       </w:pPr>
-      <w:r>
-        <w:rPr>
-          <w:rFonts w:ascii="Roboto" w:cs="Roboto" w:eastAsia="Roboto" w:hAnsi="Roboto"/>
-          <w:sz w:val="21"/>
-          <w:szCs w:val="21"/>
-          <w:rtl w:val="0"/>
-        </w:rPr>
-        <w:t xml:space="preserve">La transition ne peut pas être une réécriture générale. Les goldens et preuves utiles doivent rester verts ou être remplacés par une preuve au moins équivalente. Aucun chemin parallèle durable n’est acceptable. Les artefacts autoritatifs doivent être versionnés, validés et déterministes lorsque leur sémantique l’exige. Le Kernel ne doit pas hardcoder les frameworks. Les generated systems restent source-owned et opérationnels sans runtime Foundation obligatoire.</w:t>
+      <w:del w:id="9013" w:author="Claude" w:date="2026-09-25T00:00:00Z">
+        <w:r>
+          <w:rPr>
+            <w:rFonts w:ascii="Roboto" w:cs="Roboto" w:eastAsia="Roboto" w:hAnsi="Roboto"/>
+            <w:sz w:val="21"/>
+            <w:szCs w:val="21"/>
+            <w:rtl w:val="0"/>
+          </w:rPr>
+          <w:delText xml:space="preserve">La transition ne peut pas être une réécriture générale. Les goldens et preuves utiles doivent rester verts ou être remplacés par une preuve au moins équivalente.</w:delText>
+        </w:r>
+      </w:del>
+      <w:ins w:id="9014" w:author="Claude" w:date="2026-09-25T00:00:00Z">
+        <w:r>
+          <w:rPr>
+            <w:rFonts w:ascii="Roboto" w:cs="Roboto" w:eastAsia="Roboto" w:hAnsi="Roboto"/>
+            <w:sz w:val="21"/>
+            <w:szCs w:val="21"/>
+            <w:rtl w:val="0"/>
+          </w:rPr>
+          <w:t xml:space="preserve">Le laboratoire n’ayant jamais été exploité, il est retiré plutôt que migré (ADR-094) ; le nouveau Kernel se construit mission par mission. Les goldens du nouveau Kernel doivent rester verts ou être remplacés par une preuve au moins équivalente.</w:t>
+        </w:r>
+      </w:ins>
+      <w:r>
+        <w:rPr>
+          <w:rFonts w:ascii="Roboto" w:cs="Roboto" w:eastAsia="Roboto" w:hAnsi="Roboto"/>
+          <w:sz w:val="21"/>
+          <w:szCs w:val="21"/>
+          <w:rtl w:val="0"/>
+        </w:rPr>
+        <w:t xml:space="preserve"> Aucun chemin parallèle durable n’est acceptable. Les artefacts autoritatifs doivent être versionnés, validés et déterministes lorsque leur sémantique l’exige. Le Kernel ne doit pas hardcoder les frameworks. Les generated systems restent source-owned et opérationnels sans runtime Foundation obligatoire.</w:t>
       </w:r>
     </w:p>
     <w:p>
@@ -3411,14 +3541,26 @@
       </w:pPr>
       <w:bookmarkStart w:colFirst="0" w:colLast="0" w:name="_j4ek1sntycqr" w:id="29"/>
       <w:bookmarkEnd w:id="29"/>
-      <w:r>
-        <w:rPr>
-          <w:rFonts w:ascii="Montserrat" w:cs="Roboto" w:eastAsia="Montserrat" w:hAnsi="Montserrat"/>
-          <w:color w:val="11102A"/>
-          <w:rtl w:val="0"/>
-        </w:rPr>
-        <w:t xml:space="preserve">4.6 Pas de big-bang cutover</w:t>
-      </w:r>
+      <w:del w:id="9015" w:author="Claude" w:date="2026-09-25T00:00:00Z">
+        <w:r>
+          <w:rPr>
+            <w:rFonts w:ascii="Montserrat" w:cs="Roboto" w:eastAsia="Montserrat" w:hAnsi="Montserrat"/>
+            <w:color w:val="11102A"/>
+            <w:rtl w:val="0"/>
+          </w:rPr>
+          <w:delText xml:space="preserve">4.6 Pas de big-bang cutover</w:delText>
+        </w:r>
+      </w:del>
+      <w:ins w:id="9016" w:author="Claude" w:date="2026-09-25T00:00:00Z">
+        <w:r>
+          <w:rPr>
+            <w:rFonts w:ascii="Montserrat" w:cs="Roboto" w:eastAsia="Montserrat" w:hAnsi="Montserrat"/>
+            <w:color w:val="11102A"/>
+            <w:rtl w:val="0"/>
+          </w:rPr>
+          <w:t xml:space="preserve">4.6 Pas de couche de compatibilité</w:t>
+        </w:r>
+      </w:ins>
     </w:p>
     <w:p>
       <w:pPr>
@@ -3429,15 +3571,28 @@
           <w:szCs w:val="21"/>
         </w:rPr>
       </w:pPr>
-      <w:r>
-        <w:rPr>
-          <w:rFonts w:ascii="Roboto" w:cs="Roboto" w:eastAsia="Roboto" w:hAnsi="Roboto"/>
-          <w:sz w:val="21"/>
-          <w:szCs w:val="21"/>
-          <w:rtl w:val="0"/>
-        </w:rPr>
-        <w:t xml:space="preserve">Le nouveau Kernel devient canonique seulement à E10, après E7–E9. Blueprint, CSM et chemins historiques servent de compatibility layer tant qu’ils gardent une valeur de preuve. Le cutover est un résultat, pas une première tâche.</w:t>
-      </w:r>
+      <w:del w:id="9017" w:author="Claude" w:date="2026-09-25T00:00:00Z">
+        <w:r>
+          <w:rPr>
+            <w:rFonts w:ascii="Roboto" w:cs="Roboto" w:eastAsia="Roboto" w:hAnsi="Roboto"/>
+            <w:sz w:val="21"/>
+            <w:szCs w:val="21"/>
+            <w:rtl w:val="0"/>
+          </w:rPr>
+          <w:delText xml:space="preserve">Le nouveau Kernel devient canonique seulement à E10, après E7–E9. Blueprint, CSM et chemins historiques servent de compatibility layer tant qu’ils gardent une valeur de preuve. Le cutover est un résultat, pas une première tâche.</w:delText>
+        </w:r>
+      </w:del>
+      <w:ins w:id="9018" w:author="Claude" w:date="2026-09-25T00:00:00Z">
+        <w:r>
+          <w:rPr>
+            <w:rFonts w:ascii="Roboto" w:cs="Roboto" w:eastAsia="Roboto" w:hAnsi="Roboto"/>
+            <w:sz w:val="21"/>
+            <w:szCs w:val="21"/>
+            <w:rtl w:val="0"/>
+          </w:rPr>
+          <w:t xml:space="preserve">Le laboratoire, jamais mis en production ni utilisé, est retiré dès R0 (ADR-094) : il n’y a ni couche de compatibilité ni chemin historique à maintenir. Le nouveau Kernel est le seul chemin dès E1 ; E10 reste le gate où la V1 est déclarée canonique, après preuve par E7–E9. La canonisation est un résultat, pas une première tâche.</w:t>
+        </w:r>
+      </w:ins>
     </w:p>
     <w:p>
       <w:pPr>
@@ -3485,14 +3640,36 @@
           <w:szCs w:val="21"/>
         </w:rPr>
       </w:pPr>
-      <w:r>
-        <w:rPr>
-          <w:rFonts w:ascii="Roboto" w:cs="Roboto" w:eastAsia="Roboto" w:hAnsi="Roboto"/>
-          <w:sz w:val="21"/>
-          <w:szCs w:val="21"/>
-          <w:rtl w:val="0"/>
-        </w:rPr>
-        <w:t xml:space="preserve">Les sept runtimes du laboratoire deviennent des reference extensions. R0/V1 prouvent d’abord le protocole sur un runtime puis une substitution réelle. La réintégration progressive des autres runtimes vient après la preuve de la frontière. Cette stratégie protège la qualité et évite de multiplier le travail avant validation du modèle.</w:t>
+      <w:del w:id="9019" w:author="Claude" w:date="2026-09-25T00:00:00Z">
+        <w:r>
+          <w:rPr>
+            <w:rFonts w:ascii="Roboto" w:cs="Roboto" w:eastAsia="Roboto" w:hAnsi="Roboto"/>
+            <w:sz w:val="21"/>
+            <w:szCs w:val="21"/>
+            <w:rtl w:val="0"/>
+          </w:rPr>
+          <w:delText xml:space="preserve">Les sept runtimes du laboratoire deviennent des reference extensions.</w:delText>
+        </w:r>
+      </w:del>
+      <w:ins w:id="9020" w:author="Claude" w:date="2026-09-25T00:00:00Z">
+        <w:r>
+          <w:rPr>
+            <w:rFonts w:ascii="Roboto" w:cs="Roboto" w:eastAsia="Roboto" w:hAnsi="Roboto"/>
+            <w:sz w:val="21"/>
+            <w:szCs w:val="21"/>
+            <w:rtl w:val="0"/>
+          </w:rPr>
+          <w:t xml:space="preserve">Les sept runtimes du laboratoire ne sont pas repris : chaque runtime est réécrit comme adapter du protocole E2 (ADR-094).</w:t>
+        </w:r>
+      </w:ins>
+      <w:r>
+        <w:rPr>
+          <w:rFonts w:ascii="Roboto" w:cs="Roboto" w:eastAsia="Roboto" w:hAnsi="Roboto"/>
+          <w:sz w:val="21"/>
+          <w:szCs w:val="21"/>
+          <w:rtl w:val="0"/>
+        </w:rPr>
+        <w:t xml:space="preserve"> R0/V1 prouvent d’abord le protocole sur un runtime puis une substitution réelle. La réintégration progressive des autres runtimes vient après la preuve de la frontière. Cette stratégie protège la qualité et évite de multiplier le travail avant validation du modèle.</w:t>
       </w:r>
     </w:p>
     <w:p>
@@ -3769,7 +3946,29 @@
         <w:rPr>
           <w:rFonts w:ascii="Roboto" w:hAnsi="Roboto" w:eastAsia="Roboto"/>
         </w:rPr>
-        <w:t>Canonical cutover: moment où le nouveau Kernel devient le chemin de référence et où l’ancien pipeline est rétrogradé au rôle d’import/compatibilité. Il n’est autorisé qu’après preuve.</w:t>
+        <w:t xml:space="preserve">Canonical cutover: </w:t>
+      </w:r>
+      <w:del w:id="9021" w:author="Claude" w:date="2026-09-25T00:00:00Z">
+        <w:r>
+          <w:rPr>
+            <w:rFonts w:ascii="Roboto" w:hAnsi="Roboto" w:eastAsia="Roboto"/>
+          </w:rPr>
+          <w:delText xml:space="preserve">moment où le nouveau Kernel devient le chemin de référence et où l’ancien pipeline est rétrogradé au rôle d’import/compatibilité.</w:delText>
+        </w:r>
+      </w:del>
+      <w:ins w:id="9022" w:author="Claude" w:date="2026-09-25T00:00:00Z">
+        <w:r>
+          <w:rPr>
+            <w:rFonts w:ascii="Roboto" w:hAnsi="Roboto" w:eastAsia="Roboto"/>
+          </w:rPr>
+          <w:t xml:space="preserve">moment où le chemin Foundation est déclaré chemin de référence de la V1 ; depuis ADR-094, aucun ancien pipeline n’est à rétrograder.</w:t>
+        </w:r>
+      </w:ins>
+      <w:r>
+        <w:rPr>
+          <w:rFonts w:ascii="Roboto" w:hAnsi="Roboto" w:eastAsia="Roboto"/>
+        </w:rPr>
+        <w:t xml:space="preserve"> Il n’est autorisé qu’après preuve.</w:t>
       </w:r>
     </w:p>
     <w:p>
@@ -3821,14 +4020,26 @@
       </w:pPr>
       <w:bookmarkStart w:colFirst="0" w:colLast="0" w:name="_3xx4x08xf9kf" w:id="33"/>
       <w:bookmarkEnd w:id="33"/>
-      <w:r>
-        <w:rPr>
-          <w:rFonts w:ascii="Montserrat" w:cs="Roboto" w:eastAsia="Montserrat" w:hAnsi="Montserrat"/>
-          <w:color w:val="11102A"/>
-          <w:rtl w:val="0"/>
-        </w:rPr>
-        <w:t xml:space="preserve">6.1 Scénario A — passage du laboratoire à R0/V1</w:t>
-      </w:r>
+      <w:del w:id="9023" w:author="Claude" w:date="2026-09-25T00:00:00Z">
+        <w:r>
+          <w:rPr>
+            <w:rFonts w:ascii="Montserrat" w:cs="Roboto" w:eastAsia="Montserrat" w:hAnsi="Montserrat"/>
+            <w:color w:val="11102A"/>
+            <w:rtl w:val="0"/>
+          </w:rPr>
+          <w:delText xml:space="preserve">6.1 Scénario A — passage du laboratoire à R0/V1</w:delText>
+        </w:r>
+      </w:del>
+      <w:ins w:id="9024" w:author="Claude" w:date="2026-09-25T00:00:00Z">
+        <w:r>
+          <w:rPr>
+            <w:rFonts w:ascii="Montserrat" w:cs="Roboto" w:eastAsia="Montserrat" w:hAnsi="Montserrat"/>
+            <w:color w:val="11102A"/>
+            <w:rtl w:val="0"/>
+          </w:rPr>
+          <w:t xml:space="preserve">6.1 Scénario A — de R0 à V1</w:t>
+        </w:r>
+      </w:ins>
     </w:p>
     <w:p>
       <w:pPr>
@@ -3846,8 +4057,30 @@
           <w:szCs w:val="21"/>
           <w:rtl w:val="0"/>
         </w:rPr>
-        <w:t xml:space="preserve">En septembre 2026, l’équipe commence par le preflight réel du repository. E0 introduit Requirement Baseline, Decision Set, Effective Organization Context, System Definition, Domain Contract, Change Request et EvidenceRecord sans modifier la génération actuelle. E1–E3 établissent ensuite la façade Kernel, le premier Adapter Protocol et le bridge System Definition → IR. Les tests historiques restent des garde-fous.</w:t>
-      </w:r>
+        <w:t xml:space="preserve">En septembre 2026, l’équipe commence par le preflight réel du repository. E0 introduit Requirement Baseline, Decision Set, Effective Organization Context, System Definition, Domain Contract, Change Request et EvidenceRecord </w:t>
+      </w:r>
+      <w:del w:id="9025" w:author="Claude" w:date="2026-09-25T00:00:00Z">
+        <w:r>
+          <w:rPr>
+            <w:rFonts w:ascii="Roboto" w:cs="Nova Mono" w:eastAsia="Roboto" w:hAnsi="Roboto"/>
+            <w:sz w:val="21"/>
+            <w:szCs w:val="21"/>
+            <w:rtl w:val="0"/>
+          </w:rPr>
+          <w:delText xml:space="preserve">sans modifier la génération actuelle. E1–E3 établissent ensuite la façade Kernel, le premier Adapter Protocol et le bridge System Definition → IR. Les tests historiques restent des garde-fous.</w:delText>
+        </w:r>
+      </w:del>
+      <w:ins w:id="9026" w:author="Claude" w:date="2026-09-25T00:00:00Z">
+        <w:r>
+          <w:rPr>
+            <w:rFonts w:ascii="Roboto" w:cs="Nova Mono" w:eastAsia="Roboto" w:hAnsi="Roboto"/>
+            <w:sz w:val="21"/>
+            <w:szCs w:val="21"/>
+            <w:rtl w:val="0"/>
+          </w:rPr>
+          <w:t xml:space="preserve">; le laboratoire est ensuite retiré (ADR-094). E1–E3 établissent la façade Kernel et sa chaîne native, le premier Adapter Protocol et le Domain IR. Le golden Asteria sert de garde-fou.</w:t>
+        </w:r>
+      </w:ins>
     </w:p>
     <w:p>
       <w:pPr>
@@ -3881,7 +4114,38 @@
           <w:szCs w:val="21"/>
           <w:rtl w:val="0"/>
         </w:rPr>
-        <w:t xml:space="preserve">Pendant V1, E4–E8 complètent ownership, Evidence, Domain projection, organization/design bindings, Day-2 change et substitution de runtime. E9 compare Foundation à un workflow alternatif réaliste. Si le delta de valeur est prouvé, E10 peut effectuer le cutover canonique. Le Workbench et l’API V1 consomment alors le même Kernel que le CLI.</w:t>
+        <w:t xml:space="preserve">Pendant V1, E4–E8 complètent ownership, Evidence, Domain projection, organization/design bindings, Day-2 change et substitution de runtime. E9 compare Foundation à un workflow alternatif réaliste. Si le delta de valeur est prouvé, </w:t>
+      </w:r>
+      <w:del w:id="9027" w:author="Claude" w:date="2026-09-25T00:00:00Z">
+        <w:r>
+          <w:rPr>
+            <w:rFonts w:ascii="Roboto" w:cs="Roboto" w:eastAsia="Roboto" w:hAnsi="Roboto"/>
+            <w:sz w:val="21"/>
+            <w:szCs w:val="21"/>
+            <w:rtl w:val="0"/>
+          </w:rPr>
+          <w:delText xml:space="preserve">E10 peut effectuer le cutover canonique.</w:delText>
+        </w:r>
+      </w:del>
+      <w:ins w:id="9028" w:author="Claude" w:date="2026-09-25T00:00:00Z">
+        <w:r>
+          <w:rPr>
+            <w:rFonts w:ascii="Roboto" w:cs="Roboto" w:eastAsia="Roboto" w:hAnsi="Roboto"/>
+            <w:sz w:val="21"/>
+            <w:szCs w:val="21"/>
+            <w:rtl w:val="0"/>
+          </w:rPr>
+          <w:t xml:space="preserve">E10 peut déclarer le chemin Foundation canonique pour la V1.</w:t>
+        </w:r>
+      </w:ins>
+      <w:r>
+        <w:rPr>
+          <w:rFonts w:ascii="Roboto" w:cs="Roboto" w:eastAsia="Roboto" w:hAnsi="Roboto"/>
+          <w:sz w:val="21"/>
+          <w:szCs w:val="21"/>
+          <w:rtl w:val="0"/>
+        </w:rPr>
+        <w:t xml:space="preserve"> Le Workbench et l’API V1 consomment alors le même Kernel que le CLI.</w:t>
       </w:r>
     </w:p>
     <w:p>
@@ -4817,13 +5081,24 @@
                 <w:szCs w:val="17"/>
               </w:rPr>
             </w:pPr>
-            <w:r>
-              <w:rPr>
-                <w:rFonts w:ascii="Roboto" w:hAnsi="Roboto" w:eastAsia="Roboto"/>
-                <w:sz w:val="17"/>
-              </w:rPr>
-              <w:t>Prouver nouveau Kernel/Extension/SystemDefinition sans perdre les goldens</w:t>
-            </w:r>
+            <w:del w:id="9029" w:author="Claude" w:date="2026-09-25T00:00:00Z">
+              <w:r>
+                <w:rPr>
+                  <w:rFonts w:ascii="Roboto" w:hAnsi="Roboto" w:eastAsia="Roboto"/>
+                  <w:sz w:val="17"/>
+                </w:rPr>
+                <w:delText xml:space="preserve">Prouver nouveau Kernel/Extension/SystemDefinition sans perdre les goldens</w:delText>
+              </w:r>
+            </w:del>
+            <w:ins w:id="9030" w:author="Claude" w:date="2026-09-25T00:00:00Z">
+              <w:r>
+                <w:rPr>
+                  <w:rFonts w:ascii="Roboto" w:hAnsi="Roboto" w:eastAsia="Roboto"/>
+                  <w:sz w:val="17"/>
+                </w:rPr>
+                <w:t xml:space="preserve">Prouver nouveau Kernel/Extension/SystemDefinition sur une base unique</w:t>
+              </w:r>
+            </w:ins>
           </w:p>
         </w:tc>
         <w:tc>
@@ -4863,13 +5138,24 @@
                 <w:szCs w:val="17"/>
               </w:rPr>
             </w:pPr>
-            <w:r>
-              <w:rPr>
-                <w:rFonts w:ascii="Roboto" w:hAnsi="Roboto" w:eastAsia="Roboto"/>
-                <w:sz w:val="17"/>
-              </w:rPr>
-              <w:t>Contrats, Kernel façade, adapter seam, IR bridge</w:t>
-            </w:r>
+            <w:del w:id="9031" w:author="Claude" w:date="2026-09-25T00:00:00Z">
+              <w:r>
+                <w:rPr>
+                  <w:rFonts w:ascii="Roboto" w:hAnsi="Roboto" w:eastAsia="Roboto"/>
+                  <w:sz w:val="17"/>
+                </w:rPr>
+                <w:delText xml:space="preserve">Contrats, Kernel façade, adapter seam, IR bridge</w:delText>
+              </w:r>
+            </w:del>
+            <w:ins w:id="9032" w:author="Claude" w:date="2026-09-25T00:00:00Z">
+              <w:r>
+                <w:rPr>
+                  <w:rFonts w:ascii="Roboto" w:hAnsi="Roboto" w:eastAsia="Roboto"/>
+                  <w:sz w:val="17"/>
+                </w:rPr>
+                <w:t xml:space="preserve">Contrats, Kernel façade, Adapter Protocol, Domain IR</w:t>
+              </w:r>
+            </w:ins>
           </w:p>
         </w:tc>
         <w:tc>
@@ -4960,8 +5246,26 @@
                 <w:rFonts w:ascii="Roboto" w:hAnsi="Roboto" w:eastAsia="Roboto"/>
                 <w:sz w:val="17"/>
               </w:rPr>
-              <w:t>Pipeline déterministe ; adapter non hardcodé ; goldens préservés</w:t>
-            </w:r>
+              <w:t xml:space="preserve">Pipeline déterministe ; </w:t>
+            </w:r>
+            <w:del w:id="9033" w:author="Claude" w:date="2026-09-25T00:00:00Z">
+              <w:r>
+                <w:rPr>
+                  <w:rFonts w:ascii="Roboto" w:hAnsi="Roboto" w:eastAsia="Roboto"/>
+                  <w:sz w:val="17"/>
+                </w:rPr>
+                <w:delText xml:space="preserve">adapter non hardcodé ; goldens préservés</w:delText>
+              </w:r>
+            </w:del>
+            <w:ins w:id="9034" w:author="Claude" w:date="2026-09-25T00:00:00Z">
+              <w:r>
+                <w:rPr>
+                  <w:rFonts w:ascii="Roboto" w:hAnsi="Roboto" w:eastAsia="Roboto"/>
+                  <w:sz w:val="17"/>
+                </w:rPr>
+                <w:t xml:space="preserve">adapter non hardcodé ; golden Asteria vert</w:t>
+              </w:r>
+            </w:ins>
           </w:p>
         </w:tc>
       </w:tr>
@@ -7301,13 +7605,24 @@
                 <w:szCs w:val="18"/>
               </w:rPr>
             </w:pPr>
-            <w:r>
-              <w:rPr>
-                <w:rFonts w:ascii="Roboto" w:hAnsi="Roboto" w:eastAsia="Roboto"/>
-                <w:sz w:val="17"/>
-              </w:rPr>
-              <w:t>CLI/test via validate-resolve-plan ; legacy déterministe identique</w:t>
-            </w:r>
+            <w:del w:id="9035" w:author="Claude" w:date="2026-09-25T00:00:00Z">
+              <w:r>
+                <w:rPr>
+                  <w:rFonts w:ascii="Roboto" w:hAnsi="Roboto" w:eastAsia="Roboto"/>
+                  <w:sz w:val="17"/>
+                </w:rPr>
+                <w:delText xml:space="preserve">CLI/test via validate-resolve-plan ; legacy déterministe identique</w:delText>
+              </w:r>
+            </w:del>
+            <w:ins w:id="9036" w:author="Claude" w:date="2026-09-25T00:00:00Z">
+              <w:r>
+                <w:rPr>
+                  <w:rFonts w:ascii="Roboto" w:hAnsi="Roboto" w:eastAsia="Roboto"/>
+                  <w:sz w:val="17"/>
+                </w:rPr>
+                <w:t xml:space="preserve">CLI/test via validate-resolve-plan ; mêmes entrées → mêmes octets ; UNSUPPORTED explicite ; aucun framework dans le Kernel (ADR-095)</w:t>
+              </w:r>
+            </w:ins>
           </w:p>
         </w:tc>
       </w:tr>
@@ -7445,13 +7760,24 @@
                 <w:szCs w:val="18"/>
               </w:rPr>
             </w:pPr>
-            <w:r>
-              <w:rPr>
-                <w:rFonts w:ascii="Roboto" w:hAnsi="Roboto" w:eastAsia="Roboto"/>
-                <w:sz w:val="17"/>
-              </w:rPr>
-              <w:t>Adapter Protocol v0 + premier wrapper</w:t>
-            </w:r>
+            <w:del w:id="9037" w:author="Claude" w:date="2026-09-25T00:00:00Z">
+              <w:r>
+                <w:rPr>
+                  <w:rFonts w:ascii="Roboto" w:hAnsi="Roboto" w:eastAsia="Roboto"/>
+                  <w:sz w:val="17"/>
+                </w:rPr>
+                <w:delText xml:space="preserve">Adapter Protocol v0 + premier wrapper</w:delText>
+              </w:r>
+            </w:del>
+            <w:ins w:id="9038" w:author="Claude" w:date="2026-09-25T00:00:00Z">
+              <w:r>
+                <w:rPr>
+                  <w:rFonts w:ascii="Roboto" w:hAnsi="Roboto" w:eastAsia="Roboto"/>
+                  <w:sz w:val="17"/>
+                </w:rPr>
+                <w:t xml:space="preserve">Adapter Protocol v0 + premier adapter</w:t>
+              </w:r>
+            </w:ins>
           </w:p>
         </w:tc>
         <w:tc>
@@ -7635,13 +7961,24 @@
                 <w:szCs w:val="18"/>
               </w:rPr>
             </w:pPr>
-            <w:r>
-              <w:rPr>
-                <w:rFonts w:ascii="Roboto" w:hAnsi="Roboto" w:eastAsia="Roboto"/>
-                <w:sz w:val="17"/>
-              </w:rPr>
-              <w:t>System Definition → Internal IR Bridge</w:t>
-            </w:r>
+            <w:del w:id="9039" w:author="Claude" w:date="2026-09-25T00:00:00Z">
+              <w:r>
+                <w:rPr>
+                  <w:rFonts w:ascii="Roboto" w:hAnsi="Roboto" w:eastAsia="Roboto"/>
+                  <w:sz w:val="17"/>
+                </w:rPr>
+                <w:delText xml:space="preserve">System Definition → Internal IR Bridge</w:delText>
+              </w:r>
+            </w:del>
+            <w:ins w:id="9040" w:author="Claude" w:date="2026-09-25T00:00:00Z">
+              <w:r>
+                <w:rPr>
+                  <w:rFonts w:ascii="Roboto" w:hAnsi="Roboto" w:eastAsia="Roboto"/>
+                  <w:sz w:val="17"/>
+                </w:rPr>
+                <w:t xml:space="preserve">Domain IR et enrichissement de l’IR</w:t>
+              </w:r>
+            </w:ins>
           </w:p>
         </w:tc>
         <w:tc>
@@ -9011,13 +9348,24 @@
                 <w:szCs w:val="18"/>
               </w:rPr>
             </w:pPr>
-            <w:r>
-              <w:rPr>
-                <w:rFonts w:ascii="Roboto" w:hAnsi="Roboto" w:eastAsia="Roboto"/>
-                <w:sz w:val="17"/>
-              </w:rPr>
-              <w:t>Seulement si E7–E9 valident suffisamment ; legacy → compatibility/import</w:t>
-            </w:r>
+            <w:del w:id="9041" w:author="Claude" w:date="2026-09-25T00:00:00Z">
+              <w:r>
+                <w:rPr>
+                  <w:rFonts w:ascii="Roboto" w:hAnsi="Roboto" w:eastAsia="Roboto"/>
+                  <w:sz w:val="17"/>
+                </w:rPr>
+                <w:delText xml:space="preserve">Seulement si E7–E9 valident suffisamment ; legacy → compatibility/import</w:delText>
+              </w:r>
+            </w:del>
+            <w:ins w:id="9042" w:author="Claude" w:date="2026-09-25T00:00:00Z">
+              <w:r>
+                <w:rPr>
+                  <w:rFonts w:ascii="Roboto" w:hAnsi="Roboto" w:eastAsia="Roboto"/>
+                  <w:sz w:val="17"/>
+                </w:rPr>
+                <w:t xml:space="preserve">Seulement si E7–E9 valident suffisamment ; aucun legacy à basculer (ADR-094)</w:t>
+              </w:r>
+            </w:ins>
           </w:p>
         </w:tc>
       </w:tr>
@@ -11237,13 +11585,24 @@
                 <w:szCs w:val="18"/>
               </w:rPr>
             </w:pPr>
-            <w:r>
-              <w:rPr>
-                <w:rFonts w:ascii="Roboto" w:hAnsi="Roboto" w:eastAsia="Roboto"/>
-                <w:sz w:val="17"/>
-              </w:rPr>
-              <w:t>E0–E3 + goldens legacy préservés</w:t>
-            </w:r>
+            <w:del w:id="9043" w:author="Claude" w:date="2026-09-25T00:00:00Z">
+              <w:r>
+                <w:rPr>
+                  <w:rFonts w:ascii="Roboto" w:hAnsi="Roboto" w:eastAsia="Roboto"/>
+                  <w:sz w:val="17"/>
+                </w:rPr>
+                <w:delText xml:space="preserve">E0–E3 + goldens legacy préservés</w:delText>
+              </w:r>
+            </w:del>
+            <w:ins w:id="9044" w:author="Claude" w:date="2026-09-25T00:00:00Z">
+              <w:r>
+                <w:rPr>
+                  <w:rFonts w:ascii="Roboto" w:hAnsi="Roboto" w:eastAsia="Roboto"/>
+                  <w:sz w:val="17"/>
+                </w:rPr>
+                <w:t xml:space="preserve">E0–E3 + golden Asteria vert</w:t>
+              </w:r>
+            </w:ins>
           </w:p>
         </w:tc>
         <w:tc>

</xml_diff>